<commit_message>
rename the demo lender to Acme Bank
Crestline Bank is a real bank. Every fixture, template, policy, portal brand
(AB monogram, --ab-* tokens), Apex comment, agent script, storyboard and doc
now says Acme Bank; generated PDFs and Doc Gen templates regenerated and
re-uploaded as new versions of the same Box files, the credit policy Hub
retitled, static resources refreshed, and the agent republished.

Co-Authored-By: Claude Fable 5.1 <noreply@anthropic.com>
</commit_message>
<xml_diff>
--- a/output/docgen/harborview-term-sheet-2026-markup.docx
+++ b/output/docgen/harborview-term-sheet-2026-markup.docx
@@ -44,7 +44,7 @@
           <w:color w:val="5F6368"/>
           <w:sz w:val="24"/>
         </w:rPr>
-        <w:t>Crestline Bank and Harborview Logistics Holdings LLC | LOS-2026-Harborview | Draft, with borrower markup</w:t>
+        <w:t>Acme Bank and Harborview Logistics Holdings LLC | LOS-2026-Harborview | Draft, with borrower markup</w:t>
       </w:r>
     </w:p>
     <w:p>
@@ -254,7 +254,7 @@
         <w:color w:val="5F6368"/>
         <w:sz w:val="16"/>
       </w:rPr>
-      <w:t>Crestline Bank | LOS-2026-Harborview</w:t>
+      <w:t>Acme Bank | LOS-2026-Harborview</w:t>
     </w:r>
   </w:p>
 </w:ftr>

</xml_diff>